<commit_message>
Update IDeaS role: full-time AI & Automation Developer since Nov 2025
Resumes (all three, PDF/DOCX/HTML), website experience, enterprise case
study, JSON-LD and strategy docs now show the conversion: Software
Developer Intern (Jan-Jun 2025), BI & Automation Intern (Jul-Oct 2025),
AI & Automation Developer (Nov 2025 - present).

Co-Authored-By: Claude Opus 5.5 <noreply@anthropic.com>
Claude-Session: https://claude.ai/code/session_013wGsDvY7gwVGYXCgMADv3V
</commit_message>
<xml_diff>
--- a/resume/dist/Naman_Chordia_AI_Engineer_Resume.docx
+++ b/resume/dist/Naman_Chordia_AI_Engineer_Resume.docx
@@ -228,11 +228,11 @@
         <w:rPr>
           <w:b w:val="0"/>
         </w:rPr>
-        <w:t>Business Intelligence &amp; Automation Intern</w:t>
+        <w:t>AI &amp; Automation Developer</w:t>
       </w:r>
       <w:r>
         <w:tab/>
-        <w:t>Jul 2025 – Present</w:t>
+        <w:t>Nov 2025 – Present</w:t>
       </w:r>
     </w:p>
     <w:p>
@@ -241,7 +241,7 @@
         <w:spacing w:after="20"/>
       </w:pPr>
       <w:r>
-        <w:t>Added LLM-written narrative (Microsoft AI Builder) to a Python forecast-review pipeline that computes forecast vs. projections and renders PDF, Word and Excel reports; Dockerised through SIT/UAT.</w:t>
+        <w:t>Added LLM-written narrative (Microsoft AI Builder) to a Python forecast-review pipeline that computes forecast vs. projections and renders PDF, Word and Excel reports; Dockerised through SIT, UAT and hypercare.</w:t>
       </w:r>
     </w:p>
     <w:p>
@@ -260,6 +260,23 @@
       </w:pPr>
       <w:r>
         <w:t>Built Playwright browser automation that validates client setup across Salesforce, the G3 revenue-management UI and its database, in Dockerised test environments.</w:t>
+      </w:r>
+    </w:p>
+    <w:p>
+      <w:pPr>
+        <w:tabs>
+          <w:tab w:pos="10325" w:val="right"/>
+        </w:tabs>
+      </w:pPr>
+      <w:r>
+        <w:rPr>
+          <w:b w:val="0"/>
+        </w:rPr>
+        <w:t>Business Intelligence &amp; Automation Intern</w:t>
+      </w:r>
+      <w:r>
+        <w:tab/>
+        <w:t>Jul 2025 – Oct 2025</w:t>
       </w:r>
     </w:p>
     <w:p>

</xml_diff>

<commit_message>
Add AI voice sales agent to resumes and portfolio; drop product drafts
- Resumes (FDE, AI, SDE): new project entry linking
  github.com/NamanChordia07/ai-voice-sales-agent, written as a two-person
  client project with my own contributions named (FreJun integration,
  call lifecycle, live-test fixes, ~2.9 s median latency, 121 tests).
  Summaries and skills updated; still one page each, ATS checks pass.
- Site: /work/voice-sales-agent case study (architecture, decisions, my
  part, limits), home hero and work list, OG images, e2e coverage.
- Strategy: product concepts marked superseded; interview prep covers
  the voice agent.

Co-Authored-By: Claude Opus 5.5 <noreply@anthropic.com>
Claude-Session: https://claude.ai/code/session_013wGsDvY7gwVGYXCgMADv3V
</commit_message>
<xml_diff>
--- a/resume/dist/Naman_Chordia_AI_Engineer_Resume.docx
+++ b/resume/dist/Naman_Chordia_AI_Engineer_Resume.docx
@@ -77,7 +77,7 @@
         <w:rPr>
           <w:b w:val="0"/>
         </w:rPr>
-        <w:t>Applied AI engineer who makes LLM output trustworthy enough to ship: Proofline (report verification benchmarked on 32k labelled claims), LLM commentary in IDeaS (a SAS company) report automation, a production multimodal Gemini app.</w:t>
+        <w:t>Applied AI engineer who ships LLM systems to production: a real-time AI voice sales agent (STT, LLM, TTS), Proofline (verification benchmarked on 32k labelled claims), and LLM report automation at IDeaS (a SAS company).</w:t>
       </w:r>
     </w:p>
     <w:p>
@@ -133,7 +133,30 @@
         <w:spacing w:after="20"/>
       </w:pPr>
       <w:r>
-        <w:t>Designed the evaluation with independent ground truth (3 domains, 9 injected error types, held-out phrasing): 98.9–100% recall at 1.1–4.5% false alarms on unseen phrasing vs. 16–20% for a naive value lookup; ablations show a fixed ±1% tolerance yields 24–29% false alarms.</w:t>
+        <w:t>Designed the evaluation with independent ground truth (3 domains, 9 error types, held-out phrasing): 98.9–100% recall at 1.1–4.5% false alarms on unseen phrasing vs. 16–20% for a naive value lookup.</w:t>
+      </w:r>
+    </w:p>
+    <w:p>
+      <w:pPr>
+        <w:tabs>
+          <w:tab w:pos="10325" w:val="right"/>
+        </w:tabs>
+      </w:pPr>
+      <w:r>
+        <w:rPr>
+          <w:b/>
+        </w:rPr>
+        <w:t>AI Voice Sales Agent</w:t>
+      </w:r>
+      <w:r>
+        <w:rPr>
+          <w:i/>
+        </w:rPr>
+        <w:t xml:space="preserve"> | Python, FastAPI, OpenAI</w:t>
+      </w:r>
+      <w:r>
+        <w:tab/>
+        <w:t>github.com/NamanChordia07/ai-voice-sales-agent | Sep – Oct 2026</w:t>
       </w:r>
     </w:p>
     <w:p>
@@ -142,7 +165,16 @@
         <w:spacing w:after="20"/>
       </w:pPr>
       <w:r>
-        <w:t>Shipped as a Python library, CI-gating CLI and an MCP server agents can call, with a guarded Gemini/Claude loop (draft, verify, targeted feedback, deterministic repair); 71 tests, 95% coverage, mypy --strict.</w:t>
+        <w:t>Co-built a real-time AI voice agent that qualifies sales leads over the phone: streaming speech-to-text, an LLM with schema-validated output (the model proposes, the app decides), text-to-speech and barge-in.</w:t>
+      </w:r>
+    </w:p>
+    <w:p>
+      <w:pPr>
+        <w:pStyle w:val="ListBullet"/>
+        <w:spacing w:after="20"/>
+      </w:pPr>
+      <w:r>
+        <w:t>Cut voice latency to a measured ~2.9 s median (end of speech to agent audio) by benchmarking models, reordering prompts for caching, one deadline per turn and streamed playback; 121 automated tests.</w:t>
       </w:r>
     </w:p>
     <w:p>
@@ -174,16 +206,7 @@
         <w:spacing w:after="20"/>
       </w:pPr>
       <w:r>
-        <w:t>Shipped a Windows desktop assistant (cluecode.in) that sends screen captures to Gemini with the user's own key and streams answers into an overlay: model discovery and fallback, stall detection, versioned prompts with a prompt-injection guard, keys encrypted with Windows DPAPI and never sent to the server.</w:t>
-      </w:r>
-    </w:p>
-    <w:p>
-      <w:pPr>
-        <w:pStyle w:val="ListBullet"/>
-        <w:spacing w:after="20"/>
-      </w:pPr>
-      <w:r>
-        <w:t>Built the Next.js/Postgres backend (auth, Razorpay subscriptions, device-session leases, admin console) with 270+ automated tests, including Electron security and WCAG 2.1 AA end-to-end suites.</w:t>
+        <w:t>Shipped a desktop assistant (cluecode.in) streaming multimodal Gemini answers: model fallback, stall detection, versioned prompts with an injection guard, user keys DPAPI-encrypted; Next.js/Postgres backend, 270+ tests.</w:t>
       </w:r>
     </w:p>
     <w:p>
@@ -316,15 +339,6 @@
     </w:p>
     <w:p>
       <w:pPr>
-        <w:pStyle w:val="ListBullet"/>
-        <w:spacing w:after="20"/>
-      </w:pPr>
-      <w:r>
-        <w:t>Added custom date-range APIs and shipped the new UI behind a SQL feature toggle for a controlled rollout.</w:t>
-      </w:r>
-    </w:p>
-    <w:p>
-      <w:pPr>
         <w:tabs>
           <w:tab w:pos="10325" w:val="right"/>
         </w:tabs>
@@ -389,7 +403,7 @@
         <w:t xml:space="preserve">AI / LLM: </w:t>
       </w:r>
       <w:r>
-        <w:t>Gemini and Claude APIs, Microsoft AI Builder, MCP, LLM evaluation and benchmarking, guardrails, multimodal input, streaming</w:t>
+        <w:t>OpenAI, Gemini and Claude APIs, real-time voice agents (STT/TTS, barge-in), MCP, LLM evaluation, guardrails</w:t>
       </w:r>
     </w:p>
     <w:p>
@@ -422,7 +436,7 @@
         <w:t xml:space="preserve">Engineering: </w:t>
       </w:r>
       <w:r>
-        <w:t>Next.js, Electron, Spring Boot, PostgreSQL, Docker, pytest, Hypothesis, GitHub Actions</w:t>
+        <w:t>FastAPI, WebSockets, Next.js, Electron, Spring Boot, PostgreSQL, Docker, pytest, GitHub Actions</w:t>
       </w:r>
     </w:p>
     <w:p>

</xml_diff>

<commit_message>
One combined resume on the site; fix LinkedIn and Proofline links
- Resume: new combined "web" version (general wording, borrows FDE
  phrasing) is the only resume on the website; FDE/AI/SDE versions stay in
  resume/dist for applications. build.py and ats_check.py handle a variant
  fallback and public copies only for variants marked public. All four
  versions one page, ATS checks pass.
- LinkedIn is linkedin.com/in/naman-chordia-291b7a22a everywhere (resumes,
  site, JSON-LD, profile README); the old URL pointed to the wrong profile.
- Proofline's GitHub repo is not public yet, so the resumes link its case
  study and the site shows no dead source links until it is.
- Resume page redesigned for a single resume; home contact box offers one
  download. E2E tests cover the single PDF and the corrected links.

Co-Authored-By: Claude Opus 5.5 <noreply@anthropic.com>
Claude-Session: https://claude.ai/code/session_013wGsDvY7gwVGYXCgMADv3V
</commit_message>
<xml_diff>
--- a/resume/dist/Naman_Chordia_AI_Engineer_Resume.docx
+++ b/resume/dist/Naman_Chordia_AI_Engineer_Resume.docx
@@ -51,7 +51,7 @@
           <w:b w:val="0"/>
           <w:sz w:val="19"/>
         </w:rPr>
-        <w:t>namanchordia.vercel.app | github.com/NamanChordia07 | linkedin.com/in/naman-chordia</w:t>
+        <w:t>namanchordia.vercel.app | github.com/NamanChordia07 | linkedin.com/in/naman-chordia-291b7a22a</w:t>
       </w:r>
     </w:p>
     <w:p>
@@ -115,7 +115,7 @@
       </w:r>
       <w:r>
         <w:tab/>
-        <w:t>github.com/NamanChordia07/proofline | Sep 2026</w:t>
+        <w:t>namanchordia.vercel.app/work/proofline | Sep 2026</w:t>
       </w:r>
     </w:p>
     <w:p>

</xml_diff>